<commit_message>
Datasheet, Fusion wurden aktualisiert.
</commit_message>
<xml_diff>
--- a/Dokumentation_Prototyping/Bericht_Prototyping_20250914.docx
+++ b/Dokumentation_Prototyping/Bericht_Prototyping_20250914.docx
@@ -9,6 +9,7 @@
         <w:rPr>
           <w:sz w:val="48"/>
           <w:szCs w:val="48"/>
+          <w:lang w:val="fr-CH"/>
         </w:rPr>
       </w:pPr>
       <w:proofErr w:type="spellStart"/>
@@ -16,6 +17,7 @@
         <w:rPr>
           <w:sz w:val="48"/>
           <w:szCs w:val="48"/>
+          <w:lang w:val="fr-CH"/>
         </w:rPr>
         <w:t>Prototyping</w:t>
       </w:r>
@@ -28,6 +30,7 @@
         <w:rPr>
           <w:sz w:val="48"/>
           <w:szCs w:val="48"/>
+          <w:lang w:val="fr-CH"/>
         </w:rPr>
       </w:pPr>
       <w:proofErr w:type="spellStart"/>
@@ -35,6 +38,7 @@
         <w:rPr>
           <w:sz w:val="48"/>
           <w:szCs w:val="48"/>
+          <w:lang w:val="fr-CH"/>
         </w:rPr>
         <w:t>Reaction</w:t>
       </w:r>
@@ -43,6 +47,7 @@
         <w:rPr>
           <w:sz w:val="48"/>
           <w:szCs w:val="48"/>
+          <w:lang w:val="fr-CH"/>
         </w:rPr>
         <w:t xml:space="preserve"> Wheel Balancer (ESP32)</w:t>
       </w:r>
@@ -66,19 +71,17 @@
     </w:p>
     <w:p>
       <w:r>
-        <w:t xml:space="preserve">  </w:t>
-      </w:r>
-    </w:p>
-    <w:p>
-      <w:r>
+        <w:rPr>
+          <w:noProof/>
+        </w:rPr>
         <w:drawing>
-          <wp:anchor distT="0" distB="0" distL="114300" distR="114300" simplePos="0" relativeHeight="251658240" behindDoc="0" locked="0" layoutInCell="1" allowOverlap="1" wp14:anchorId="4C6FEA84" wp14:editId="0E30044D">
+          <wp:anchor distT="0" distB="0" distL="114300" distR="114300" simplePos="0" relativeHeight="251658240" behindDoc="0" locked="0" layoutInCell="1" allowOverlap="1" wp14:anchorId="4C6FEA84" wp14:editId="498D3E3A">
             <wp:simplePos x="0" y="0"/>
             <wp:positionH relativeFrom="margin">
-              <wp:align>center</wp:align>
+              <wp:posOffset>723007</wp:posOffset>
             </wp:positionH>
             <wp:positionV relativeFrom="paragraph">
-              <wp:posOffset>200645</wp:posOffset>
+              <wp:posOffset>111776</wp:posOffset>
             </wp:positionV>
             <wp:extent cx="4476750" cy="3197860"/>
             <wp:effectExtent l="0" t="0" r="0" b="2540"/>
@@ -135,9 +138,10 @@
           </wp:anchor>
         </w:drawing>
       </w:r>
-    </w:p>
-    <w:p/>
-    <w:p/>
+      <w:r>
+        <w:t xml:space="preserve">  </w:t>
+      </w:r>
+    </w:p>
     <w:p/>
     <w:p/>
     <w:p/>
@@ -242,7 +246,6 @@
         </w:r>
       </w:hyperlink>
     </w:p>
-    <w:p/>
     <w:p>
       <w:r>
         <w:t xml:space="preserve">Referent: </w:t>
@@ -266,8 +269,308 @@
       </w:r>
       <w:proofErr w:type="spellEnd"/>
       <w:r>
-        <w:t xml:space="preserve"> und ICT</w:t>
-      </w:r>
+        <w:t xml:space="preserve"> und </w:t>
+      </w:r>
+      <w:r>
+        <w:t>MR</w:t>
+      </w:r>
+    </w:p>
+    <w:p>
+      <w:r>
+        <w:t>Link:</w:t>
+      </w:r>
+    </w:p>
+    <w:p>
+      <w:r>
+        <w:t xml:space="preserve">GitHub: </w:t>
+      </w:r>
+      <w:r>
+        <w:t xml:space="preserve"> </w:t>
+      </w:r>
+      <w:hyperlink r:id="rId11" w:history="1">
+        <w:proofErr w:type="spellStart"/>
+        <w:r>
+          <w:rPr>
+            <w:rStyle w:val="Hyperlink"/>
+          </w:rPr>
+          <w:t>EmrahTek</w:t>
+        </w:r>
+        <w:proofErr w:type="spellEnd"/>
+        <w:r>
+          <w:rPr>
+            <w:rStyle w:val="Hyperlink"/>
+          </w:rPr>
+          <w:t xml:space="preserve">/Prototyping_Projekt_HS25: This </w:t>
+        </w:r>
+        <w:proofErr w:type="spellStart"/>
+        <w:r>
+          <w:rPr>
+            <w:rStyle w:val="Hyperlink"/>
+          </w:rPr>
+          <w:t>repository</w:t>
+        </w:r>
+        <w:proofErr w:type="spellEnd"/>
+        <w:r>
+          <w:rPr>
+            <w:rStyle w:val="Hyperlink"/>
+          </w:rPr>
+          <w:t xml:space="preserve"> </w:t>
+        </w:r>
+        <w:proofErr w:type="spellStart"/>
+        <w:r>
+          <w:rPr>
+            <w:rStyle w:val="Hyperlink"/>
+          </w:rPr>
+          <w:t>has</w:t>
+        </w:r>
+        <w:proofErr w:type="spellEnd"/>
+        <w:r>
+          <w:rPr>
+            <w:rStyle w:val="Hyperlink"/>
+          </w:rPr>
+          <w:t xml:space="preserve"> </w:t>
+        </w:r>
+        <w:proofErr w:type="spellStart"/>
+        <w:r>
+          <w:rPr>
+            <w:rStyle w:val="Hyperlink"/>
+          </w:rPr>
+          <w:t>been</w:t>
+        </w:r>
+        <w:proofErr w:type="spellEnd"/>
+        <w:r>
+          <w:rPr>
+            <w:rStyle w:val="Hyperlink"/>
+          </w:rPr>
+          <w:t xml:space="preserve"> </w:t>
+        </w:r>
+        <w:proofErr w:type="spellStart"/>
+        <w:r>
+          <w:rPr>
+            <w:rStyle w:val="Hyperlink"/>
+          </w:rPr>
+          <w:t>created</w:t>
+        </w:r>
+        <w:proofErr w:type="spellEnd"/>
+        <w:r>
+          <w:rPr>
+            <w:rStyle w:val="Hyperlink"/>
+          </w:rPr>
+          <w:t xml:space="preserve"> </w:t>
+        </w:r>
+        <w:proofErr w:type="spellStart"/>
+        <w:r>
+          <w:rPr>
+            <w:rStyle w:val="Hyperlink"/>
+          </w:rPr>
+          <w:t>for</w:t>
+        </w:r>
+        <w:proofErr w:type="spellEnd"/>
+        <w:r>
+          <w:rPr>
+            <w:rStyle w:val="Hyperlink"/>
+          </w:rPr>
+          <w:t xml:space="preserve"> </w:t>
+        </w:r>
+        <w:proofErr w:type="spellStart"/>
+        <w:r>
+          <w:rPr>
+            <w:rStyle w:val="Hyperlink"/>
+          </w:rPr>
+          <w:t>project</w:t>
+        </w:r>
+        <w:proofErr w:type="spellEnd"/>
+        <w:r>
+          <w:rPr>
+            <w:rStyle w:val="Hyperlink"/>
+          </w:rPr>
+          <w:t xml:space="preserve"> </w:t>
+        </w:r>
+        <w:proofErr w:type="spellStart"/>
+        <w:r>
+          <w:rPr>
+            <w:rStyle w:val="Hyperlink"/>
+          </w:rPr>
+          <w:t>tracking</w:t>
+        </w:r>
+        <w:proofErr w:type="spellEnd"/>
+        <w:r>
+          <w:rPr>
+            <w:rStyle w:val="Hyperlink"/>
+          </w:rPr>
+          <w:t xml:space="preserve">. All </w:t>
+        </w:r>
+        <w:proofErr w:type="spellStart"/>
+        <w:r>
+          <w:rPr>
+            <w:rStyle w:val="Hyperlink"/>
+          </w:rPr>
+          <w:t>documentation</w:t>
+        </w:r>
+        <w:proofErr w:type="spellEnd"/>
+        <w:r>
+          <w:rPr>
+            <w:rStyle w:val="Hyperlink"/>
+          </w:rPr>
+          <w:t xml:space="preserve"> and </w:t>
+        </w:r>
+        <w:proofErr w:type="spellStart"/>
+        <w:r>
+          <w:rPr>
+            <w:rStyle w:val="Hyperlink"/>
+          </w:rPr>
+          <w:t>software</w:t>
+        </w:r>
+        <w:proofErr w:type="spellEnd"/>
+        <w:r>
+          <w:rPr>
+            <w:rStyle w:val="Hyperlink"/>
+          </w:rPr>
+          <w:t xml:space="preserve"> </w:t>
+        </w:r>
+        <w:proofErr w:type="spellStart"/>
+        <w:r>
+          <w:rPr>
+            <w:rStyle w:val="Hyperlink"/>
+          </w:rPr>
+          <w:t>data</w:t>
+        </w:r>
+        <w:proofErr w:type="spellEnd"/>
+        <w:r>
+          <w:rPr>
+            <w:rStyle w:val="Hyperlink"/>
+          </w:rPr>
+          <w:t xml:space="preserve"> </w:t>
+        </w:r>
+        <w:proofErr w:type="spellStart"/>
+        <w:r>
+          <w:rPr>
+            <w:rStyle w:val="Hyperlink"/>
+          </w:rPr>
+          <w:t>related</w:t>
+        </w:r>
+        <w:proofErr w:type="spellEnd"/>
+        <w:r>
+          <w:rPr>
+            <w:rStyle w:val="Hyperlink"/>
+          </w:rPr>
+          <w:t xml:space="preserve"> </w:t>
+        </w:r>
+        <w:proofErr w:type="spellStart"/>
+        <w:r>
+          <w:rPr>
+            <w:rStyle w:val="Hyperlink"/>
+          </w:rPr>
+          <w:t>to</w:t>
+        </w:r>
+        <w:proofErr w:type="spellEnd"/>
+        <w:r>
+          <w:rPr>
+            <w:rStyle w:val="Hyperlink"/>
+          </w:rPr>
+          <w:t xml:space="preserve"> </w:t>
+        </w:r>
+        <w:proofErr w:type="spellStart"/>
+        <w:r>
+          <w:rPr>
+            <w:rStyle w:val="Hyperlink"/>
+          </w:rPr>
+          <w:t>the</w:t>
+        </w:r>
+        <w:proofErr w:type="spellEnd"/>
+        <w:r>
+          <w:rPr>
+            <w:rStyle w:val="Hyperlink"/>
+          </w:rPr>
+          <w:t xml:space="preserve"> </w:t>
+        </w:r>
+        <w:proofErr w:type="spellStart"/>
+        <w:r>
+          <w:rPr>
+            <w:rStyle w:val="Hyperlink"/>
+          </w:rPr>
+          <w:t>project</w:t>
+        </w:r>
+        <w:proofErr w:type="spellEnd"/>
+        <w:r>
+          <w:rPr>
+            <w:rStyle w:val="Hyperlink"/>
+          </w:rPr>
+          <w:t xml:space="preserve"> </w:t>
+        </w:r>
+        <w:proofErr w:type="spellStart"/>
+        <w:r>
+          <w:rPr>
+            <w:rStyle w:val="Hyperlink"/>
+          </w:rPr>
+          <w:t>can</w:t>
+        </w:r>
+        <w:proofErr w:type="spellEnd"/>
+        <w:r>
+          <w:rPr>
+            <w:rStyle w:val="Hyperlink"/>
+          </w:rPr>
+          <w:t xml:space="preserve"> </w:t>
+        </w:r>
+        <w:proofErr w:type="spellStart"/>
+        <w:r>
+          <w:rPr>
+            <w:rStyle w:val="Hyperlink"/>
+          </w:rPr>
+          <w:t>be</w:t>
+        </w:r>
+        <w:proofErr w:type="spellEnd"/>
+        <w:r>
+          <w:rPr>
+            <w:rStyle w:val="Hyperlink"/>
+          </w:rPr>
+          <w:t xml:space="preserve"> </w:t>
+        </w:r>
+        <w:proofErr w:type="spellStart"/>
+        <w:r>
+          <w:rPr>
+            <w:rStyle w:val="Hyperlink"/>
+          </w:rPr>
+          <w:t>tracked</w:t>
+        </w:r>
+        <w:proofErr w:type="spellEnd"/>
+        <w:r>
+          <w:rPr>
+            <w:rStyle w:val="Hyperlink"/>
+          </w:rPr>
+          <w:t xml:space="preserve"> </w:t>
+        </w:r>
+        <w:proofErr w:type="spellStart"/>
+        <w:r>
+          <w:rPr>
+            <w:rStyle w:val="Hyperlink"/>
+          </w:rPr>
+          <w:t>here</w:t>
+        </w:r>
+        <w:proofErr w:type="spellEnd"/>
+        <w:r>
+          <w:rPr>
+            <w:rStyle w:val="Hyperlink"/>
+          </w:rPr>
+          <w:t>.</w:t>
+        </w:r>
+      </w:hyperlink>
+      <w:r>
+        <w:t xml:space="preserve"> </w:t>
+      </w:r>
+    </w:p>
+    <w:p>
+      <w:r>
+        <w:t xml:space="preserve">OneDrive: </w:t>
+      </w:r>
+      <w:hyperlink r:id="rId12" w:history="1">
+        <w:r>
+          <w:rPr>
+            <w:rStyle w:val="Hyperlink"/>
+          </w:rPr>
+          <w:t>Projekt_Prototyping_HS25</w:t>
+        </w:r>
+      </w:hyperlink>
     </w:p>
     <w:p/>
     <w:p/>
@@ -840,9 +1143,7 @@
     <w:p>
       <w:r>
         <w:tab/>
-      </w:r>
-      <w:r>
-        <w:t>7. Schlussteil</w:t>
+        <w:t>7. Test</w:t>
       </w:r>
     </w:p>
     <w:p>
@@ -850,20 +1151,46 @@
         <w:tab/>
       </w:r>
       <w:r>
+        <w:t>8</w:t>
+      </w:r>
+      <w:r>
+        <w:t>. Schlussteil</w:t>
+      </w:r>
+    </w:p>
+    <w:p>
+      <w:r>
         <w:tab/>
-        <w:t>7.1 Fazit</w:t>
-      </w:r>
-    </w:p>
-    <w:p>
+      </w:r>
       <w:r>
         <w:tab/>
-        <w:t>8. Quellenverzeichnis</w:t>
+      </w:r>
+      <w:r>
+        <w:t>8</w:t>
+      </w:r>
+      <w:r>
+        <w:t>.1 Fazit</w:t>
       </w:r>
     </w:p>
     <w:p>
       <w:r>
         <w:tab/>
-        <w:t>9. Abbildungsverzeichnis</w:t>
+      </w:r>
+      <w:r>
+        <w:t>9</w:t>
+      </w:r>
+      <w:r>
+        <w:t>. Quellenverzeichnis</w:t>
+      </w:r>
+    </w:p>
+    <w:p>
+      <w:r>
+        <w:tab/>
+      </w:r>
+      <w:r>
+        <w:t>10</w:t>
+      </w:r>
+      <w:r>
+        <w:t>. Abbildungsverzeichnis</w:t>
       </w:r>
     </w:p>
     <w:p/>
@@ -890,7 +1217,6 @@
           <w:sz w:val="28"/>
           <w:szCs w:val="28"/>
         </w:rPr>
-        <w:lastRenderedPageBreak/>
         <w:t>Abkürzungsverzeichnis</w:t>
       </w:r>
     </w:p>
@@ -910,36 +1236,56 @@
       </w:r>
       <w:proofErr w:type="spellEnd"/>
       <w:r>
+        <w:t xml:space="preserve"> Board</w:t>
+      </w:r>
+    </w:p>
+    <w:p>
+      <w:r>
+        <w:t>M</w:t>
+      </w:r>
+      <w:r>
+        <w:t>PU</w:t>
+      </w:r>
+      <w:r>
+        <w:tab/>
+      </w:r>
+      <w:r>
+        <w:tab/>
+      </w:r>
+      <w:r>
+        <w:t>HW123-</w:t>
+      </w:r>
+      <w:r>
+        <w:t>MPU</w:t>
+      </w:r>
+      <w:r>
+        <w:t>6050 Gyroskop</w:t>
+      </w:r>
+    </w:p>
+    <w:p>
+      <w:r>
+        <w:t xml:space="preserve">OOP </w:t>
+      </w:r>
+      <w:r>
+        <w:tab/>
+      </w:r>
+      <w:r>
+        <w:tab/>
+        <w:t xml:space="preserve">Objekt </w:t>
+      </w:r>
+      <w:proofErr w:type="spellStart"/>
+      <w:r>
+        <w:t>Orijentiert</w:t>
+      </w:r>
+      <w:proofErr w:type="spellEnd"/>
+      <w:r>
         <w:t xml:space="preserve"> </w:t>
       </w:r>
       <w:proofErr w:type="spellStart"/>
       <w:r>
-        <w:t>Board</w:t>
+        <w:t>Programming</w:t>
       </w:r>
       <w:proofErr w:type="spellEnd"/>
-    </w:p>
-    <w:p>
-      <w:r>
-        <w:t>M</w:t>
-      </w:r>
-      <w:r>
-        <w:t>PU</w:t>
-      </w:r>
-      <w:r>
-        <w:tab/>
-      </w:r>
-      <w:r>
-        <w:tab/>
-      </w:r>
-      <w:r>
-        <w:t>HW123-</w:t>
-      </w:r>
-      <w:r>
-        <w:t>MPU</w:t>
-      </w:r>
-      <w:r>
-        <w:t>6050 Gyroskop</w:t>
-      </w:r>
     </w:p>
     <w:p>
       <w:pPr>
@@ -1017,8 +1363,935 @@
         <w:t xml:space="preserve"> </w:t>
       </w:r>
     </w:p>
+    <w:p/>
+    <w:p/>
+    <w:p/>
+    <w:p/>
+    <w:p/>
+    <w:p/>
+    <w:p/>
+    <w:p/>
+    <w:p/>
+    <w:p/>
+    <w:p/>
+    <w:p/>
+    <w:p>
+      <w:pPr>
+        <w:rPr>
+          <w:sz w:val="28"/>
+          <w:szCs w:val="28"/>
+        </w:rPr>
+      </w:pPr>
+    </w:p>
+    <w:p>
+      <w:pPr>
+        <w:pStyle w:val="Listenabsatz"/>
+        <w:numPr>
+          <w:ilvl w:val="0"/>
+          <w:numId w:val="3"/>
+        </w:numPr>
+        <w:rPr>
+          <w:sz w:val="28"/>
+          <w:szCs w:val="28"/>
+        </w:rPr>
+      </w:pPr>
+      <w:r>
+        <w:rPr>
+          <w:sz w:val="28"/>
+          <w:szCs w:val="28"/>
+        </w:rPr>
+        <w:lastRenderedPageBreak/>
+        <w:t>Elektronik</w:t>
+      </w:r>
+    </w:p>
+    <w:p>
+      <w:pPr>
+        <w:pStyle w:val="Listenabsatz"/>
+        <w:rPr>
+          <w:sz w:val="28"/>
+          <w:szCs w:val="28"/>
+        </w:rPr>
+      </w:pPr>
+      <w:r>
+        <w:rPr>
+          <w:sz w:val="28"/>
+          <w:szCs w:val="28"/>
+        </w:rPr>
+        <w:t>3.1 Erste Iteration Elektronik</w:t>
+      </w:r>
+    </w:p>
+    <w:p>
+      <w:r>
+        <w:t xml:space="preserve">Für das System wurde zudem kein eigenes elektronisches PCB-Design erstellt. Die Einrichtung erfolgte mit dem </w:t>
+      </w:r>
+      <w:proofErr w:type="spellStart"/>
+      <w:r>
+        <w:t>FireBeetle</w:t>
+      </w:r>
+      <w:proofErr w:type="spellEnd"/>
+      <w:r>
+        <w:t xml:space="preserve"> V4 ESP32 Board über Arduino. Die erforderlichen Bibliotheken wurden heruntergeladen, ebenso die spezifischen Bibliotheken für das ESP32-Board. Zu Testzwecken wurde über den seriellen Port die Nachricht „Hello World“ empfangen. Anschließend wurden Tests mit dem MPU6050 durchgeführt, wobei auch </w:t>
+      </w:r>
+      <w:proofErr w:type="spellStart"/>
+      <w:r>
+        <w:t>Gyroskopdaten</w:t>
+      </w:r>
+      <w:proofErr w:type="spellEnd"/>
+      <w:r>
+        <w:t xml:space="preserve"> erfasst wurden.</w:t>
+      </w:r>
+    </w:p>
+    <w:p>
+      <w:r>
+        <w:drawing>
+          <wp:anchor distT="0" distB="0" distL="114300" distR="114300" simplePos="0" relativeHeight="251659264" behindDoc="0" locked="0" layoutInCell="1" allowOverlap="1" wp14:anchorId="188B80CA" wp14:editId="4521802E">
+            <wp:simplePos x="0" y="0"/>
+            <wp:positionH relativeFrom="margin">
+              <wp:posOffset>439838</wp:posOffset>
+            </wp:positionH>
+            <wp:positionV relativeFrom="paragraph">
+              <wp:posOffset>12700</wp:posOffset>
+            </wp:positionV>
+            <wp:extent cx="2609850" cy="2306320"/>
+            <wp:effectExtent l="0" t="0" r="0" b="0"/>
+            <wp:wrapThrough wrapText="bothSides">
+              <wp:wrapPolygon edited="0">
+                <wp:start x="0" y="0"/>
+                <wp:lineTo x="0" y="21410"/>
+                <wp:lineTo x="21442" y="21410"/>
+                <wp:lineTo x="21442" y="0"/>
+                <wp:lineTo x="0" y="0"/>
+              </wp:wrapPolygon>
+            </wp:wrapThrough>
+            <wp:docPr id="1636465078" name="Grafik 1" descr="Ein Bild, das Text, Elektronik, Elektrisches Bauelement, Elektronisches Bauteil enthält.&#10;&#10;KI-generierte Inhalte können fehlerhaft sein."/>
+            <wp:cNvGraphicFramePr>
+              <a:graphicFrameLocks xmlns:a="http://schemas.openxmlformats.org/drawingml/2006/main" noChangeAspect="1"/>
+            </wp:cNvGraphicFramePr>
+            <a:graphic xmlns:a="http://schemas.openxmlformats.org/drawingml/2006/main">
+              <a:graphicData uri="http://schemas.openxmlformats.org/drawingml/2006/picture">
+                <pic:pic xmlns:pic="http://schemas.openxmlformats.org/drawingml/2006/picture">
+                  <pic:nvPicPr>
+                    <pic:cNvPr id="1636465078" name="Grafik 1" descr="Ein Bild, das Text, Elektronik, Elektrisches Bauelement, Elektronisches Bauteil enthält.&#10;&#10;KI-generierte Inhalte können fehlerhaft sein."/>
+                    <pic:cNvPicPr/>
+                  </pic:nvPicPr>
+                  <pic:blipFill>
+                    <a:blip r:embed="rId13" cstate="print">
+                      <a:extLst>
+                        <a:ext uri="{28A0092B-C50C-407E-A947-70E740481C1C}">
+                          <a14:useLocalDpi xmlns:a14="http://schemas.microsoft.com/office/drawing/2010/main" val="0"/>
+                        </a:ext>
+                      </a:extLst>
+                    </a:blip>
+                    <a:stretch>
+                      <a:fillRect/>
+                    </a:stretch>
+                  </pic:blipFill>
+                  <pic:spPr>
+                    <a:xfrm>
+                      <a:off x="0" y="0"/>
+                      <a:ext cx="2609850" cy="2306320"/>
+                    </a:xfrm>
+                    <a:prstGeom prst="rect">
+                      <a:avLst/>
+                    </a:prstGeom>
+                  </pic:spPr>
+                </pic:pic>
+              </a:graphicData>
+            </a:graphic>
+            <wp14:sizeRelH relativeFrom="margin">
+              <wp14:pctWidth>0</wp14:pctWidth>
+            </wp14:sizeRelH>
+            <wp14:sizeRelV relativeFrom="margin">
+              <wp14:pctHeight>0</wp14:pctHeight>
+            </wp14:sizeRelV>
+          </wp:anchor>
+        </w:drawing>
+      </w:r>
+    </w:p>
+    <w:p>
+      <w:pPr>
+        <w:ind w:firstLine="708"/>
+      </w:pPr>
+      <w:r>
+        <w:t xml:space="preserve">Operating </w:t>
+      </w:r>
+      <w:proofErr w:type="spellStart"/>
+      <w:r>
+        <w:t>Voltage</w:t>
+      </w:r>
+      <w:proofErr w:type="spellEnd"/>
+      <w:r>
+        <w:t>: 3.3 V</w:t>
+      </w:r>
+    </w:p>
+    <w:p>
+      <w:pPr>
+        <w:ind w:firstLine="708"/>
+        <w:rPr>
+          <w:lang w:val="fr-CH"/>
+        </w:rPr>
+      </w:pPr>
+      <w:r>
+        <w:rPr>
+          <w:lang w:val="fr-CH"/>
+        </w:rPr>
+        <w:t xml:space="preserve">Input </w:t>
+      </w:r>
+      <w:proofErr w:type="gramStart"/>
+      <w:r>
+        <w:rPr>
+          <w:lang w:val="fr-CH"/>
+        </w:rPr>
+        <w:t>Voltage:</w:t>
+      </w:r>
+      <w:proofErr w:type="gramEnd"/>
+      <w:r>
+        <w:rPr>
+          <w:lang w:val="fr-CH"/>
+        </w:rPr>
+        <w:t xml:space="preserve"> 3.3 V - 5.5 V</w:t>
+      </w:r>
+    </w:p>
+    <w:p>
+      <w:pPr>
+        <w:ind w:firstLine="708"/>
+        <w:rPr>
+          <w:lang w:val="fr-CH"/>
+        </w:rPr>
+      </w:pPr>
+      <w:r>
+        <w:rPr>
+          <w:lang w:val="fr-CH"/>
+        </w:rPr>
+        <w:t>Main</w:t>
+      </w:r>
+      <w:r>
+        <w:rPr>
+          <w:lang w:val="fr-CH"/>
+        </w:rPr>
+        <w:t xml:space="preserve"> Frequency : 240 MHz</w:t>
+      </w:r>
+    </w:p>
+    <w:p>
+      <w:pPr>
+        <w:ind w:firstLine="708"/>
+        <w:rPr>
+          <w:lang w:val="fr-CH"/>
+        </w:rPr>
+      </w:pPr>
+      <w:r>
+        <w:rPr>
+          <w:lang w:val="fr-CH"/>
+        </w:rPr>
+        <w:t>Flash : 32 Mbit</w:t>
+      </w:r>
+    </w:p>
+    <w:p>
+      <w:pPr>
+        <w:rPr>
+          <w:lang w:val="fr-CH"/>
+        </w:rPr>
+      </w:pPr>
+    </w:p>
+    <w:p>
+      <w:pPr>
+        <w:rPr>
+          <w:lang w:val="fr-CH"/>
+        </w:rPr>
+      </w:pPr>
+    </w:p>
+    <w:p>
+      <w:pPr>
+        <w:rPr>
+          <w:lang w:val="fr-CH"/>
+        </w:rPr>
+      </w:pPr>
+    </w:p>
+    <w:p>
+      <w:proofErr w:type="spellStart"/>
+      <w:r>
+        <w:rPr>
+          <w:lang w:val="fr-CH"/>
+        </w:rPr>
+        <w:t>Bild</w:t>
+      </w:r>
+      <w:proofErr w:type="spellEnd"/>
+      <w:r>
+        <w:rPr>
+          <w:lang w:val="fr-CH"/>
+        </w:rPr>
+        <w:t xml:space="preserve"> </w:t>
+      </w:r>
+      <w:proofErr w:type="gramStart"/>
+      <w:r>
+        <w:rPr>
+          <w:lang w:val="fr-CH"/>
+        </w:rPr>
+        <w:t>1:</w:t>
+      </w:r>
+      <w:proofErr w:type="gramEnd"/>
+      <w:r>
+        <w:rPr>
+          <w:lang w:val="fr-CH"/>
+        </w:rPr>
+        <w:t xml:space="preserve"> </w:t>
+      </w:r>
+      <w:hyperlink r:id="rId14" w:history="1">
+        <w:r>
+          <w:rPr>
+            <w:rStyle w:val="Hyperlink"/>
+            <w:lang w:val="fr-CH"/>
+          </w:rPr>
+          <w:t xml:space="preserve">ESP32 </w:t>
+        </w:r>
+        <w:r>
+          <w:rPr>
+            <w:rStyle w:val="Hyperlink"/>
+            <w:sz w:val="12"/>
+            <w:szCs w:val="12"/>
+            <w:lang w:val="fr-CH"/>
+          </w:rPr>
+          <w:t>MPU</w:t>
+        </w:r>
+        <w:r>
+          <w:rPr>
+            <w:rStyle w:val="Hyperlink"/>
+            <w:lang w:val="fr-CH"/>
+          </w:rPr>
+          <w:t xml:space="preserve">-6050 </w:t>
+        </w:r>
+        <w:proofErr w:type="spellStart"/>
+        <w:r>
+          <w:rPr>
+            <w:rStyle w:val="Hyperlink"/>
+            <w:lang w:val="fr-CH"/>
+          </w:rPr>
+          <w:t>Accelerometer</w:t>
+        </w:r>
+        <w:proofErr w:type="spellEnd"/>
+        <w:r>
+          <w:rPr>
+            <w:rStyle w:val="Hyperlink"/>
+            <w:lang w:val="fr-CH"/>
+          </w:rPr>
+          <w:t xml:space="preserve"> and Gyroscope (Arduino) | </w:t>
+        </w:r>
+        <w:proofErr w:type="spellStart"/>
+        <w:r>
+          <w:rPr>
+            <w:rStyle w:val="Hyperlink"/>
+            <w:lang w:val="fr-CH"/>
+          </w:rPr>
+          <w:t>Random</w:t>
+        </w:r>
+        <w:proofErr w:type="spellEnd"/>
+        <w:r>
+          <w:rPr>
+            <w:rStyle w:val="Hyperlink"/>
+            <w:lang w:val="fr-CH"/>
+          </w:rPr>
+          <w:t xml:space="preserve"> </w:t>
+        </w:r>
+        <w:proofErr w:type="spellStart"/>
+        <w:r>
+          <w:rPr>
+            <w:rStyle w:val="Hyperlink"/>
+            <w:lang w:val="fr-CH"/>
+          </w:rPr>
+          <w:t>Nerd</w:t>
+        </w:r>
+        <w:proofErr w:type="spellEnd"/>
+        <w:r>
+          <w:rPr>
+            <w:rStyle w:val="Hyperlink"/>
+            <w:lang w:val="fr-CH"/>
+          </w:rPr>
+          <w:t xml:space="preserve"> Tutorials</w:t>
+        </w:r>
+      </w:hyperlink>
+    </w:p>
+    <w:p/>
+    <w:p/>
+    <w:p/>
+    <w:p/>
+    <w:p/>
+    <w:p/>
+    <w:p/>
+    <w:p/>
+    <w:p/>
+    <w:p/>
+    <w:p/>
+    <w:p/>
+    <w:p>
+      <w:pPr>
+        <w:rPr>
+          <w:lang w:val="fr-CH"/>
+        </w:rPr>
+      </w:pPr>
+    </w:p>
+    <w:p>
+      <w:pPr>
+        <w:pStyle w:val="Listenabsatz"/>
+        <w:numPr>
+          <w:ilvl w:val="0"/>
+          <w:numId w:val="3"/>
+        </w:numPr>
+        <w:rPr>
+          <w:sz w:val="28"/>
+          <w:szCs w:val="28"/>
+        </w:rPr>
+      </w:pPr>
+      <w:proofErr w:type="spellStart"/>
+      <w:r>
+        <w:rPr>
+          <w:sz w:val="28"/>
+          <w:szCs w:val="28"/>
+        </w:rPr>
+        <w:lastRenderedPageBreak/>
+        <w:t>Prototyping</w:t>
+      </w:r>
+      <w:proofErr w:type="spellEnd"/>
+    </w:p>
+    <w:p>
+      <w:pPr>
+        <w:rPr>
+          <w:sz w:val="28"/>
+          <w:szCs w:val="28"/>
+        </w:rPr>
+      </w:pPr>
+      <w:r>
+        <w:rPr>
+          <w:sz w:val="28"/>
+          <w:szCs w:val="28"/>
+        </w:rPr>
+        <w:t>Nachdem die Projektaufgabe erhalten wurde, wurde rasch über verschiedene Ideen nachgedacht. Im Hintergrund wurden mögliche physikalische Theorien zum System recherchiert. Es wurde insbesondere die Winkelimpulstheorie untersucht. Man entschied, dass die Stabilität des Systems mit einem Reaktionsrad gewährleistet werden kann. In der ersten Phase wurde zwar an einigen der unten gezeigten CAD-Modelle gearbeitet, jedoch wurde das Design später verändert.</w:t>
+      </w:r>
+    </w:p>
+    <w:p>
+      <w:pPr>
+        <w:rPr>
+          <w:sz w:val="28"/>
+          <w:szCs w:val="28"/>
+        </w:rPr>
+      </w:pPr>
+      <w:r>
+        <w:rPr>
+          <w:sz w:val="28"/>
+          <w:szCs w:val="28"/>
+        </w:rPr>
+        <w:drawing>
+          <wp:anchor distT="0" distB="0" distL="114300" distR="114300" simplePos="0" relativeHeight="251660288" behindDoc="0" locked="0" layoutInCell="1" allowOverlap="1" wp14:anchorId="022BD5BC" wp14:editId="42F31FCA">
+            <wp:simplePos x="0" y="0"/>
+            <wp:positionH relativeFrom="margin">
+              <wp:align>left</wp:align>
+            </wp:positionH>
+            <wp:positionV relativeFrom="paragraph">
+              <wp:posOffset>352425</wp:posOffset>
+            </wp:positionV>
+            <wp:extent cx="2968625" cy="2641600"/>
+            <wp:effectExtent l="0" t="0" r="3175" b="6350"/>
+            <wp:wrapThrough wrapText="bothSides">
+              <wp:wrapPolygon edited="0">
+                <wp:start x="0" y="0"/>
+                <wp:lineTo x="0" y="21496"/>
+                <wp:lineTo x="21484" y="21496"/>
+                <wp:lineTo x="21484" y="0"/>
+                <wp:lineTo x="0" y="0"/>
+              </wp:wrapPolygon>
+            </wp:wrapThrough>
+            <wp:docPr id="2110231929" name="Grafik 1" descr="Ein Bild, das Entwurf, Zeichnung, Design enthält.&#10;&#10;KI-generierte Inhalte können fehlerhaft sein."/>
+            <wp:cNvGraphicFramePr>
+              <a:graphicFrameLocks xmlns:a="http://schemas.openxmlformats.org/drawingml/2006/main" noChangeAspect="1"/>
+            </wp:cNvGraphicFramePr>
+            <a:graphic xmlns:a="http://schemas.openxmlformats.org/drawingml/2006/main">
+              <a:graphicData uri="http://schemas.openxmlformats.org/drawingml/2006/picture">
+                <pic:pic xmlns:pic="http://schemas.openxmlformats.org/drawingml/2006/picture">
+                  <pic:nvPicPr>
+                    <pic:cNvPr id="2110231929" name="Grafik 1" descr="Ein Bild, das Entwurf, Zeichnung, Design enthält.&#10;&#10;KI-generierte Inhalte können fehlerhaft sein."/>
+                    <pic:cNvPicPr/>
+                  </pic:nvPicPr>
+                  <pic:blipFill>
+                    <a:blip r:embed="rId15" cstate="print">
+                      <a:extLst>
+                        <a:ext uri="{28A0092B-C50C-407E-A947-70E740481C1C}">
+                          <a14:useLocalDpi xmlns:a14="http://schemas.microsoft.com/office/drawing/2010/main" val="0"/>
+                        </a:ext>
+                      </a:extLst>
+                    </a:blip>
+                    <a:stretch>
+                      <a:fillRect/>
+                    </a:stretch>
+                  </pic:blipFill>
+                  <pic:spPr>
+                    <a:xfrm>
+                      <a:off x="0" y="0"/>
+                      <a:ext cx="2968625" cy="2641600"/>
+                    </a:xfrm>
+                    <a:prstGeom prst="rect">
+                      <a:avLst/>
+                    </a:prstGeom>
+                  </pic:spPr>
+                </pic:pic>
+              </a:graphicData>
+            </a:graphic>
+            <wp14:sizeRelH relativeFrom="margin">
+              <wp14:pctWidth>0</wp14:pctWidth>
+            </wp14:sizeRelH>
+            <wp14:sizeRelV relativeFrom="margin">
+              <wp14:pctHeight>0</wp14:pctHeight>
+            </wp14:sizeRelV>
+          </wp:anchor>
+        </w:drawing>
+      </w:r>
+    </w:p>
+    <w:p>
+      <w:pPr>
+        <w:rPr>
+          <w:sz w:val="28"/>
+          <w:szCs w:val="28"/>
+        </w:rPr>
+      </w:pPr>
+    </w:p>
+    <w:p>
+      <w:pPr>
+        <w:rPr>
+          <w:sz w:val="28"/>
+          <w:szCs w:val="28"/>
+        </w:rPr>
+      </w:pPr>
+    </w:p>
+    <w:p>
+      <w:pPr>
+        <w:rPr>
+          <w:sz w:val="28"/>
+          <w:szCs w:val="28"/>
+        </w:rPr>
+      </w:pPr>
+    </w:p>
+    <w:p>
+      <w:pPr>
+        <w:rPr>
+          <w:sz w:val="28"/>
+          <w:szCs w:val="28"/>
+        </w:rPr>
+      </w:pPr>
+    </w:p>
+    <w:p>
+      <w:pPr>
+        <w:rPr>
+          <w:sz w:val="28"/>
+          <w:szCs w:val="28"/>
+        </w:rPr>
+      </w:pPr>
+    </w:p>
+    <w:p>
+      <w:pPr>
+        <w:rPr>
+          <w:sz w:val="28"/>
+          <w:szCs w:val="28"/>
+        </w:rPr>
+      </w:pPr>
+    </w:p>
+    <w:p>
+      <w:pPr>
+        <w:rPr>
+          <w:sz w:val="28"/>
+          <w:szCs w:val="28"/>
+        </w:rPr>
+      </w:pPr>
+    </w:p>
+    <w:p>
+      <w:pPr>
+        <w:rPr>
+          <w:sz w:val="28"/>
+          <w:szCs w:val="28"/>
+        </w:rPr>
+      </w:pPr>
+    </w:p>
+    <w:p>
+      <w:pPr>
+        <w:rPr>
+          <w:sz w:val="28"/>
+          <w:szCs w:val="28"/>
+        </w:rPr>
+      </w:pPr>
+      <w:r>
+        <w:rPr>
+          <w:sz w:val="28"/>
+          <w:szCs w:val="28"/>
+        </w:rPr>
+        <w:t>Bild</w:t>
+      </w:r>
+      <w:r>
+        <w:rPr>
+          <w:sz w:val="28"/>
+          <w:szCs w:val="28"/>
+        </w:rPr>
+        <w:t xml:space="preserve"> 2</w:t>
+      </w:r>
+      <w:r>
+        <w:rPr>
+          <w:sz w:val="28"/>
+          <w:szCs w:val="28"/>
+        </w:rPr>
+        <w:t>: Fusion 360</w:t>
+      </w:r>
+      <w:r>
+        <w:rPr>
+          <w:sz w:val="28"/>
+          <w:szCs w:val="28"/>
+        </w:rPr>
+        <w:t xml:space="preserve"> erste </w:t>
+      </w:r>
+      <w:proofErr w:type="spellStart"/>
+      <w:r>
+        <w:rPr>
+          <w:sz w:val="28"/>
+          <w:szCs w:val="28"/>
+        </w:rPr>
+        <w:t>model</w:t>
+      </w:r>
+      <w:proofErr w:type="spellEnd"/>
+    </w:p>
+    <w:p>
+      <w:pPr>
+        <w:rPr>
+          <w:sz w:val="28"/>
+          <w:szCs w:val="28"/>
+        </w:rPr>
+      </w:pPr>
+    </w:p>
+    <w:p>
+      <w:pPr>
+        <w:pStyle w:val="Listenabsatz"/>
+        <w:numPr>
+          <w:ilvl w:val="0"/>
+          <w:numId w:val="3"/>
+        </w:numPr>
+        <w:rPr>
+          <w:sz w:val="28"/>
+          <w:szCs w:val="28"/>
+        </w:rPr>
+      </w:pPr>
+      <w:r>
+        <w:rPr>
+          <w:sz w:val="28"/>
+          <w:szCs w:val="28"/>
+        </w:rPr>
+        <w:t>Flussdiagr</w:t>
+      </w:r>
+      <w:r>
+        <w:rPr>
+          <w:sz w:val="28"/>
+          <w:szCs w:val="28"/>
+        </w:rPr>
+        <w:t>amm</w:t>
+      </w:r>
+    </w:p>
+    <w:p>
+      <w:pPr>
+        <w:pStyle w:val="Listenabsatz"/>
+        <w:numPr>
+          <w:ilvl w:val="0"/>
+          <w:numId w:val="3"/>
+        </w:numPr>
+        <w:rPr>
+          <w:sz w:val="28"/>
+          <w:szCs w:val="28"/>
+        </w:rPr>
+      </w:pPr>
+      <w:r>
+        <w:rPr>
+          <w:sz w:val="28"/>
+          <w:szCs w:val="28"/>
+        </w:rPr>
+        <w:t>Softwareentwicklung</w:t>
+      </w:r>
+    </w:p>
+    <w:p>
+      <w:pPr>
+        <w:pStyle w:val="Listenabsatz"/>
+        <w:numPr>
+          <w:ilvl w:val="1"/>
+          <w:numId w:val="3"/>
+        </w:numPr>
+        <w:rPr>
+          <w:sz w:val="28"/>
+          <w:szCs w:val="28"/>
+        </w:rPr>
+      </w:pPr>
+      <w:r>
+        <w:rPr>
+          <w:sz w:val="28"/>
+          <w:szCs w:val="28"/>
+        </w:rPr>
+        <w:t xml:space="preserve">Erste Iteration </w:t>
+      </w:r>
+      <w:proofErr w:type="spellStart"/>
+      <w:r>
+        <w:rPr>
+          <w:sz w:val="28"/>
+          <w:szCs w:val="28"/>
+        </w:rPr>
+        <w:t>Sofwareentwicklung</w:t>
+      </w:r>
+      <w:proofErr w:type="spellEnd"/>
+      <w:r>
+        <w:rPr>
+          <w:sz w:val="28"/>
+          <w:szCs w:val="28"/>
+        </w:rPr>
+        <w:t>:</w:t>
+      </w:r>
+    </w:p>
+    <w:p>
+      <w:pPr>
+        <w:rPr>
+          <w:sz w:val="28"/>
+          <w:szCs w:val="28"/>
+        </w:rPr>
+      </w:pPr>
+      <w:r>
+        <w:rPr>
+          <w:sz w:val="28"/>
+          <w:szCs w:val="28"/>
+        </w:rPr>
+        <w:t>Das Programm wurde zunächst in C geschrieben, später jedoch aus Gründen der Modularität und im Hinblick auf OOP auf C++ umgestellt. Dabei wurde auf die Softwarequalität nach ISO-Standards geachtet. Kommentierungen und Überschriften wurden entsprechend berücksichtigt. In der ersten Phase wurde die Programmierung für das ESP32-Board in der Arduino-Umgebung vorbereitet und die notwendigen Bibliotheken heruntergeladen. Anschließend wurde „Hello World“ implementiert und Werte vom MPU6050 ausgelesen.</w:t>
+      </w:r>
+    </w:p>
+    <w:p>
+      <w:pPr>
+        <w:pStyle w:val="Listenabsatz"/>
+        <w:numPr>
+          <w:ilvl w:val="0"/>
+          <w:numId w:val="3"/>
+        </w:numPr>
+        <w:rPr>
+          <w:sz w:val="28"/>
+          <w:szCs w:val="28"/>
+        </w:rPr>
+      </w:pPr>
+      <w:r>
+        <w:rPr>
+          <w:sz w:val="28"/>
+          <w:szCs w:val="28"/>
+        </w:rPr>
+        <w:lastRenderedPageBreak/>
+        <w:t>Test</w:t>
+      </w:r>
+    </w:p>
+    <w:p>
+      <w:pPr>
+        <w:rPr>
+          <w:sz w:val="28"/>
+          <w:szCs w:val="28"/>
+        </w:rPr>
+      </w:pPr>
+      <w:r>
+        <w:rPr>
+          <w:sz w:val="28"/>
+          <w:szCs w:val="28"/>
+        </w:rPr>
+        <w:t xml:space="preserve">In der letzten Phase wurden die Konstruktionsmodelle in Fusion getestet. Mit einem Holzmodell wurde ein Motortest durchgeführt. Ab 1500 </w:t>
+      </w:r>
+      <w:proofErr w:type="spellStart"/>
+      <w:r>
+        <w:rPr>
+          <w:sz w:val="28"/>
+          <w:szCs w:val="28"/>
+        </w:rPr>
+        <w:t>ms</w:t>
+      </w:r>
+      <w:proofErr w:type="spellEnd"/>
+      <w:r>
+        <w:rPr>
+          <w:sz w:val="28"/>
+          <w:szCs w:val="28"/>
+        </w:rPr>
+        <w:t xml:space="preserve"> erfolgten Vorwärts- und Rückwärtstests des Motors.</w:t>
+      </w:r>
+    </w:p>
+    <w:p>
+      <w:pPr>
+        <w:rPr>
+          <w:sz w:val="28"/>
+          <w:szCs w:val="28"/>
+        </w:rPr>
+      </w:pPr>
+      <w:r>
+        <w:rPr>
+          <w:sz w:val="28"/>
+          <w:szCs w:val="28"/>
+        </w:rPr>
+        <w:drawing>
+          <wp:anchor distT="0" distB="0" distL="114300" distR="114300" simplePos="0" relativeHeight="251661312" behindDoc="0" locked="0" layoutInCell="1" allowOverlap="1" wp14:anchorId="653240CE" wp14:editId="1B5738C2">
+            <wp:simplePos x="0" y="0"/>
+            <wp:positionH relativeFrom="margin">
+              <wp:align>left</wp:align>
+            </wp:positionH>
+            <wp:positionV relativeFrom="paragraph">
+              <wp:posOffset>72141</wp:posOffset>
+            </wp:positionV>
+            <wp:extent cx="3009265" cy="3613785"/>
+            <wp:effectExtent l="0" t="0" r="635" b="5715"/>
+            <wp:wrapThrough wrapText="bothSides">
+              <wp:wrapPolygon edited="0">
+                <wp:start x="0" y="0"/>
+                <wp:lineTo x="0" y="21520"/>
+                <wp:lineTo x="21468" y="21520"/>
+                <wp:lineTo x="21468" y="0"/>
+                <wp:lineTo x="0" y="0"/>
+              </wp:wrapPolygon>
+            </wp:wrapThrough>
+            <wp:docPr id="823422041" name="Grafik 1" descr="Ein Bild, das Elektronik, Im Haus, Kabel, Elektrische Leitungen enthält.&#10;&#10;KI-generierte Inhalte können fehlerhaft sein."/>
+            <wp:cNvGraphicFramePr>
+              <a:graphicFrameLocks xmlns:a="http://schemas.openxmlformats.org/drawingml/2006/main" noChangeAspect="1"/>
+            </wp:cNvGraphicFramePr>
+            <a:graphic xmlns:a="http://schemas.openxmlformats.org/drawingml/2006/main">
+              <a:graphicData uri="http://schemas.openxmlformats.org/drawingml/2006/picture">
+                <pic:pic xmlns:pic="http://schemas.openxmlformats.org/drawingml/2006/picture">
+                  <pic:nvPicPr>
+                    <pic:cNvPr id="823422041" name="Grafik 1" descr="Ein Bild, das Elektronik, Im Haus, Kabel, Elektrische Leitungen enthält.&#10;&#10;KI-generierte Inhalte können fehlerhaft sein."/>
+                    <pic:cNvPicPr/>
+                  </pic:nvPicPr>
+                  <pic:blipFill>
+                    <a:blip r:embed="rId16" cstate="print">
+                      <a:extLst>
+                        <a:ext uri="{28A0092B-C50C-407E-A947-70E740481C1C}">
+                          <a14:useLocalDpi xmlns:a14="http://schemas.microsoft.com/office/drawing/2010/main" val="0"/>
+                        </a:ext>
+                      </a:extLst>
+                    </a:blip>
+                    <a:stretch>
+                      <a:fillRect/>
+                    </a:stretch>
+                  </pic:blipFill>
+                  <pic:spPr>
+                    <a:xfrm>
+                      <a:off x="0" y="0"/>
+                      <a:ext cx="3014413" cy="3620347"/>
+                    </a:xfrm>
+                    <a:prstGeom prst="rect">
+                      <a:avLst/>
+                    </a:prstGeom>
+                  </pic:spPr>
+                </pic:pic>
+              </a:graphicData>
+            </a:graphic>
+            <wp14:sizeRelH relativeFrom="margin">
+              <wp14:pctWidth>0</wp14:pctWidth>
+            </wp14:sizeRelH>
+            <wp14:sizeRelV relativeFrom="margin">
+              <wp14:pctHeight>0</wp14:pctHeight>
+            </wp14:sizeRelV>
+          </wp:anchor>
+        </w:drawing>
+      </w:r>
+      <w:r>
+        <w:rPr>
+          <w:sz w:val="28"/>
+          <w:szCs w:val="28"/>
+        </w:rPr>
+        <w:t xml:space="preserve"> </w:t>
+      </w:r>
+    </w:p>
+    <w:p>
+      <w:pPr>
+        <w:rPr>
+          <w:sz w:val="28"/>
+          <w:szCs w:val="28"/>
+        </w:rPr>
+      </w:pPr>
+    </w:p>
+    <w:p>
+      <w:pPr>
+        <w:rPr>
+          <w:sz w:val="28"/>
+          <w:szCs w:val="28"/>
+        </w:rPr>
+      </w:pPr>
+    </w:p>
+    <w:p>
+      <w:pPr>
+        <w:rPr>
+          <w:sz w:val="28"/>
+          <w:szCs w:val="28"/>
+        </w:rPr>
+      </w:pPr>
+    </w:p>
+    <w:p>
+      <w:pPr>
+        <w:rPr>
+          <w:sz w:val="28"/>
+          <w:szCs w:val="28"/>
+        </w:rPr>
+      </w:pPr>
+    </w:p>
+    <w:p>
+      <w:pPr>
+        <w:rPr>
+          <w:sz w:val="28"/>
+          <w:szCs w:val="28"/>
+        </w:rPr>
+      </w:pPr>
+    </w:p>
+    <w:p>
+      <w:pPr>
+        <w:rPr>
+          <w:sz w:val="28"/>
+          <w:szCs w:val="28"/>
+        </w:rPr>
+      </w:pPr>
+    </w:p>
+    <w:p>
+      <w:pPr>
+        <w:rPr>
+          <w:sz w:val="28"/>
+          <w:szCs w:val="28"/>
+        </w:rPr>
+      </w:pPr>
+    </w:p>
+    <w:p>
+      <w:pPr>
+        <w:rPr>
+          <w:sz w:val="28"/>
+          <w:szCs w:val="28"/>
+        </w:rPr>
+      </w:pPr>
+    </w:p>
+    <w:p>
+      <w:pPr>
+        <w:rPr>
+          <w:sz w:val="28"/>
+          <w:szCs w:val="28"/>
+        </w:rPr>
+      </w:pPr>
+    </w:p>
+    <w:p>
+      <w:pPr>
+        <w:rPr>
+          <w:sz w:val="28"/>
+          <w:szCs w:val="28"/>
+        </w:rPr>
+      </w:pPr>
+    </w:p>
+    <w:p>
+      <w:pPr>
+        <w:rPr>
+          <w:sz w:val="28"/>
+          <w:szCs w:val="28"/>
+        </w:rPr>
+      </w:pPr>
+      <w:r>
+        <w:rPr>
+          <w:sz w:val="28"/>
+          <w:szCs w:val="28"/>
+        </w:rPr>
+        <w:t>Bild 3: Motor Test mit Signal Generator</w:t>
+      </w:r>
+    </w:p>
     <w:sectPr>
-      <w:footerReference w:type="default" r:id="rId11"/>
+      <w:footerReference w:type="default" r:id="rId17"/>
       <w:pgSz w:w="11906" w:h="16838"/>
       <w:pgMar w:top="1417" w:right="1417" w:bottom="1134" w:left="1417" w:header="708" w:footer="708" w:gutter="0"/>
       <w:cols w:space="708"/>
@@ -1216,9 +2489,9 @@
   </w:abstractNum>
   <w:abstractNum w:abstractNumId="1" w15:restartNumberingAfterBreak="0">
     <w:nsid w:val="1A6A7F26"/>
-    <w:multiLevelType w:val="hybridMultilevel"/>
-    <w:tmpl w:val="62E20854"/>
-    <w:lvl w:ilvl="0" w:tplc="0807000F">
+    <w:multiLevelType w:val="multilevel"/>
+    <w:tmpl w:val="473AFB4C"/>
+    <w:lvl w:ilvl="0">
       <w:start w:val="1"/>
       <w:numFmt w:val="decimal"/>
       <w:lvlText w:val="%1."/>
@@ -1230,77 +2503,109 @@
         <w:rFonts w:hint="default"/>
       </w:rPr>
     </w:lvl>
-    <w:lvl w:ilvl="1" w:tplc="08070019" w:tentative="1">
-      <w:start w:val="1"/>
-      <w:numFmt w:val="lowerLetter"/>
-      <w:lvlText w:val="%2."/>
-      <w:lvlJc w:val="left"/>
-      <w:pPr>
-        <w:ind w:left="1440" w:hanging="360"/>
-      </w:pPr>
-    </w:lvl>
-    <w:lvl w:ilvl="2" w:tplc="0807001B" w:tentative="1">
-      <w:start w:val="1"/>
-      <w:numFmt w:val="lowerRoman"/>
-      <w:lvlText w:val="%3."/>
-      <w:lvlJc w:val="right"/>
-      <w:pPr>
-        <w:ind w:left="2160" w:hanging="180"/>
-      </w:pPr>
-    </w:lvl>
-    <w:lvl w:ilvl="3" w:tplc="0807000F" w:tentative="1">
+    <w:lvl w:ilvl="1">
       <w:start w:val="1"/>
       <w:numFmt w:val="decimal"/>
-      <w:lvlText w:val="%4."/>
+      <w:isLgl/>
+      <w:lvlText w:val="%1.%2"/>
       <w:lvlJc w:val="left"/>
       <w:pPr>
-        <w:ind w:left="2880" w:hanging="360"/>
-      </w:pPr>
+        <w:ind w:left="1440" w:hanging="720"/>
+      </w:pPr>
+      <w:rPr>
+        <w:rFonts w:hint="default"/>
+      </w:rPr>
     </w:lvl>
-    <w:lvl w:ilvl="4" w:tplc="08070019" w:tentative="1">
-      <w:start w:val="1"/>
-      <w:numFmt w:val="lowerLetter"/>
-      <w:lvlText w:val="%5."/>
-      <w:lvlJc w:val="left"/>
-      <w:pPr>
-        <w:ind w:left="3600" w:hanging="360"/>
-      </w:pPr>
-    </w:lvl>
-    <w:lvl w:ilvl="5" w:tplc="0807001B" w:tentative="1">
-      <w:start w:val="1"/>
-      <w:numFmt w:val="lowerRoman"/>
-      <w:lvlText w:val="%6."/>
-      <w:lvlJc w:val="right"/>
-      <w:pPr>
-        <w:ind w:left="4320" w:hanging="180"/>
-      </w:pPr>
-    </w:lvl>
-    <w:lvl w:ilvl="6" w:tplc="0807000F" w:tentative="1">
+    <w:lvl w:ilvl="2">
       <w:start w:val="1"/>
       <w:numFmt w:val="decimal"/>
-      <w:lvlText w:val="%7."/>
+      <w:isLgl/>
+      <w:lvlText w:val="%1.%2.%3"/>
       <w:lvlJc w:val="left"/>
       <w:pPr>
-        <w:ind w:left="5040" w:hanging="360"/>
-      </w:pPr>
+        <w:ind w:left="1800" w:hanging="720"/>
+      </w:pPr>
+      <w:rPr>
+        <w:rFonts w:hint="default"/>
+      </w:rPr>
     </w:lvl>
-    <w:lvl w:ilvl="7" w:tplc="08070019" w:tentative="1">
+    <w:lvl w:ilvl="3">
       <w:start w:val="1"/>
-      <w:numFmt w:val="lowerLetter"/>
-      <w:lvlText w:val="%8."/>
+      <w:numFmt w:val="decimal"/>
+      <w:isLgl/>
+      <w:lvlText w:val="%1.%2.%3.%4"/>
       <w:lvlJc w:val="left"/>
       <w:pPr>
-        <w:ind w:left="5760" w:hanging="360"/>
-      </w:pPr>
+        <w:ind w:left="2520" w:hanging="1080"/>
+      </w:pPr>
+      <w:rPr>
+        <w:rFonts w:hint="default"/>
+      </w:rPr>
     </w:lvl>
-    <w:lvl w:ilvl="8" w:tplc="0807001B" w:tentative="1">
+    <w:lvl w:ilvl="4">
       <w:start w:val="1"/>
-      <w:numFmt w:val="lowerRoman"/>
-      <w:lvlText w:val="%9."/>
-      <w:lvlJc w:val="right"/>
-      <w:pPr>
-        <w:ind w:left="6480" w:hanging="180"/>
-      </w:pPr>
+      <w:numFmt w:val="decimal"/>
+      <w:isLgl/>
+      <w:lvlText w:val="%1.%2.%3.%4.%5"/>
+      <w:lvlJc w:val="left"/>
+      <w:pPr>
+        <w:ind w:left="2880" w:hanging="1080"/>
+      </w:pPr>
+      <w:rPr>
+        <w:rFonts w:hint="default"/>
+      </w:rPr>
+    </w:lvl>
+    <w:lvl w:ilvl="5">
+      <w:start w:val="1"/>
+      <w:numFmt w:val="decimal"/>
+      <w:isLgl/>
+      <w:lvlText w:val="%1.%2.%3.%4.%5.%6"/>
+      <w:lvlJc w:val="left"/>
+      <w:pPr>
+        <w:ind w:left="3600" w:hanging="1440"/>
+      </w:pPr>
+      <w:rPr>
+        <w:rFonts w:hint="default"/>
+      </w:rPr>
+    </w:lvl>
+    <w:lvl w:ilvl="6">
+      <w:start w:val="1"/>
+      <w:numFmt w:val="decimal"/>
+      <w:isLgl/>
+      <w:lvlText w:val="%1.%2.%3.%4.%5.%6.%7"/>
+      <w:lvlJc w:val="left"/>
+      <w:pPr>
+        <w:ind w:left="4320" w:hanging="1800"/>
+      </w:pPr>
+      <w:rPr>
+        <w:rFonts w:hint="default"/>
+      </w:rPr>
+    </w:lvl>
+    <w:lvl w:ilvl="7">
+      <w:start w:val="1"/>
+      <w:numFmt w:val="decimal"/>
+      <w:isLgl/>
+      <w:lvlText w:val="%1.%2.%3.%4.%5.%6.%7.%8"/>
+      <w:lvlJc w:val="left"/>
+      <w:pPr>
+        <w:ind w:left="4680" w:hanging="1800"/>
+      </w:pPr>
+      <w:rPr>
+        <w:rFonts w:hint="default"/>
+      </w:rPr>
+    </w:lvl>
+    <w:lvl w:ilvl="8">
+      <w:start w:val="1"/>
+      <w:numFmt w:val="decimal"/>
+      <w:isLgl/>
+      <w:lvlText w:val="%1.%2.%3.%4.%5.%6.%7.%8.%9"/>
+      <w:lvlJc w:val="left"/>
+      <w:pPr>
+        <w:ind w:left="5400" w:hanging="2160"/>
+      </w:pPr>
+      <w:rPr>
+        <w:rFonts w:hint="default"/>
+      </w:rPr>
     </w:lvl>
   </w:abstractNum>
   <w:abstractNum w:abstractNumId="2" w15:restartNumberingAfterBreak="0">

</xml_diff>